<commit_message>
Physics, Actually Vol 3: drop 'Science for Everyone' from the illustration/cover prompt docs (imprint clause removed; author bio now 'writes the Physics, Actually series'); originals in D:\bak\2026-10-02 SfE removal
</commit_message>
<xml_diff>
--- a/Physics, Actually - SERIES/Volume 3/Vol 3 - Illustration and Cover Prompts (before gentleness pass).docx
+++ b/Physics, Actually - SERIES/Volume 3/Vol 3 - Illustration and Cover Prompts (before gentleness pass).docx
@@ -17,7 +17,7 @@
           <w:b w:val="0"/>
           <w:i w:val="0"/>
         </w:rPr>
-        <w:t>Reference document for generating the 17 chapter illustrations plus front and back cover, matching the house style already established and in active use for Physics Vol. 2 (see D:\My Books for Amazon\Science Books\Physics\Volume 2\Vol 2 - Pic 1..11.png and Vol 2 - Back Cover.png). Each chapter prompt is written to be pasted directly into an image generator. Series is branded “PHYSICS, ACTUALLY” on covers; “Science for Everyone” is the umbrella imprint used inside the book (Prologue page) and on sibling titles like The Quantum World.</w:t>
+        <w:t>Reference document for generating the 17 chapter illustrations plus front and back cover, matching the house style already established and in active use for Physics Vol. 2 (see D:\My Books for Amazon\Science Books\Physics\Volume 2\Vol 2 - Pic 1..11.png and Vol 2 - Back Cover.png). Each chapter prompt is written to be pasted directly into an image generator. Series is branded “PHYSICS, ACTUALLY” on covers and inside the book.</w:t>
       </w:r>
     </w:p>
     <w:p>
@@ -99,7 +99,7 @@
           <w:b w:val="0"/>
           <w:i w:val="0"/>
         </w:rPr>
-        <w:t>“Book back-cover illustration, portrait, deep navy-black background matching the front cover, with very faint low-opacity gray-blue equation watermarks scattered across it (Standard Model Lagrangian, a Lorenz-system equation, a string-theory action integral, a Bell-inequality expression). At the top, a thin pale-blue wireframe curve suggesting a phase-space attractor. Bold gold/amber centered headline, 3 lines: ‘The particles are settled. The chaos is real. And the edge of knowledge is closer than you think.’ Below it, 2–3 short white justified body paragraphs (blurb text, to be supplied). Below that, a rounded rectangle box with thin blue border, containing 3–4 rows, each a small line-art icon (an atom, a butterfly/attractor swirl, a knotted string, a mirror-loop) beside 1–2 lines of white text summarizing a section of the book. Near the bottom left, italic gold serif author-bio text: ‘Lothar J. Musiol writes the Science for Everyone series, translating the real mathematics of modern physics into stories anyone can follow — without ever talking down to the reader.’ Bottom right, an empty dashed-border rectangle reserved for a barcode. Same palette and layout family as the existing Physics Vol. 2 back cover.”</w:t>
+        <w:t>“Book back-cover illustration, portrait, deep navy-black background matching the front cover, with very faint low-opacity gray-blue equation watermarks scattered across it (Standard Model Lagrangian, a Lorenz-system equation, a string-theory action integral, a Bell-inequality expression). At the top, a thin pale-blue wireframe curve suggesting a phase-space attractor. Bold gold/amber centered headline, 3 lines: ‘The particles are settled. The chaos is real. And the edge of knowledge is closer than you think.’ Below it, 2–3 short white justified body paragraphs (blurb text, to be supplied). Below that, a rounded rectangle box with thin blue border, containing 3–4 rows, each a small line-art icon (an atom, a butterfly/attractor swirl, a knotted string, a mirror-loop) beside 1–2 lines of white text summarizing a section of the book. Near the bottom left, italic gold serif author-bio text: ‘Lothar J. Musiol writes the Physics, Actually series, translating the real mathematics of modern physics into stories anyone can follow — without ever talking down to the reader.’ Bottom right, an empty dashed-border rectangle reserved for a barcode. Same palette and layout family as the existing Physics Vol. 2 back cover.”</w:t>
       </w:r>
     </w:p>
     <w:p>

</xml_diff>